<commit_message>
Update binary file: Monitor_Popis-aplikace-dle-zadani.docx
The binary file `Monitor_Popis-aplikace-dle-zadani.docx` has been modified. Specific changes are not detailed due to the nature of the file, but its content differs from the previous version.
</commit_message>
<xml_diff>
--- a/Directory Monitor_Popis-aplikace-dle-zadani.docx
+++ b/Directory Monitor_Popis-aplikace-dle-zadani.docx
@@ -11,17 +11,416 @@
       </w:r>
     </w:p>
     <w:p>
+      <w:r>
+        <w:t xml:space="preserve">Pro </w:t>
+      </w:r>
+      <w:proofErr w:type="spellStart"/>
+      <w:r>
+        <w:t>úplnou</w:t>
+      </w:r>
+      <w:proofErr w:type="spellEnd"/>
+      <w:r>
+        <w:t xml:space="preserve"> </w:t>
+      </w:r>
+      <w:proofErr w:type="spellStart"/>
+      <w:r>
+        <w:t>transparentnost</w:t>
+      </w:r>
+      <w:proofErr w:type="spellEnd"/>
+      <w:r>
+        <w:t xml:space="preserve"> </w:t>
+      </w:r>
+      <w:proofErr w:type="spellStart"/>
+      <w:r>
+        <w:t>bych</w:t>
+      </w:r>
+      <w:proofErr w:type="spellEnd"/>
+      <w:r>
+        <w:t xml:space="preserve"> </w:t>
+      </w:r>
+      <w:proofErr w:type="spellStart"/>
+      <w:r>
+        <w:t>rád</w:t>
+      </w:r>
+      <w:proofErr w:type="spellEnd"/>
+      <w:r>
+        <w:t xml:space="preserve"> </w:t>
+      </w:r>
+      <w:proofErr w:type="spellStart"/>
+      <w:r>
+        <w:t>zmínil</w:t>
+      </w:r>
+      <w:proofErr w:type="spellEnd"/>
+      <w:r>
+        <w:t xml:space="preserve">, </w:t>
+      </w:r>
+      <w:proofErr w:type="spellStart"/>
+      <w:r>
+        <w:t>že</w:t>
+      </w:r>
+      <w:proofErr w:type="spellEnd"/>
+      <w:r>
+        <w:t xml:space="preserve"> </w:t>
+      </w:r>
+      <w:proofErr w:type="spellStart"/>
+      <w:r>
+        <w:t>při</w:t>
+      </w:r>
+      <w:proofErr w:type="spellEnd"/>
+      <w:r>
+        <w:t xml:space="preserve"> </w:t>
+      </w:r>
+      <w:proofErr w:type="spellStart"/>
+      <w:r>
+        <w:t>vývoji</w:t>
+      </w:r>
+      <w:proofErr w:type="spellEnd"/>
+      <w:r>
+        <w:t xml:space="preserve"> </w:t>
+      </w:r>
+      <w:proofErr w:type="spellStart"/>
+      <w:r>
+        <w:t>aplikace</w:t>
+      </w:r>
+      <w:proofErr w:type="spellEnd"/>
+      <w:r>
+        <w:t xml:space="preserve"> </w:t>
+      </w:r>
+      <w:proofErr w:type="spellStart"/>
+      <w:r>
+        <w:t>byly</w:t>
+      </w:r>
+      <w:proofErr w:type="spellEnd"/>
+      <w:r>
+        <w:t xml:space="preserve"> </w:t>
+      </w:r>
+      <w:proofErr w:type="spellStart"/>
+      <w:r>
+        <w:t>využívány</w:t>
+      </w:r>
+      <w:proofErr w:type="spellEnd"/>
+      <w:r>
+        <w:t xml:space="preserve"> AI </w:t>
+      </w:r>
+      <w:proofErr w:type="spellStart"/>
+      <w:r>
+        <w:t>nástroje</w:t>
+      </w:r>
+      <w:proofErr w:type="spellEnd"/>
+      <w:r>
+        <w:t xml:space="preserve"> </w:t>
+      </w:r>
+      <w:proofErr w:type="spellStart"/>
+      <w:r>
+        <w:t>jako</w:t>
+      </w:r>
+      <w:proofErr w:type="spellEnd"/>
+      <w:r>
+        <w:t xml:space="preserve"> </w:t>
+      </w:r>
+      <w:proofErr w:type="spellStart"/>
+      <w:r>
+        <w:t>součást</w:t>
+      </w:r>
+      <w:proofErr w:type="spellEnd"/>
+      <w:r>
+        <w:t xml:space="preserve"> </w:t>
+      </w:r>
+      <w:proofErr w:type="spellStart"/>
+      <w:r>
+        <w:t>běžného</w:t>
+      </w:r>
+      <w:proofErr w:type="spellEnd"/>
+      <w:r>
+        <w:t xml:space="preserve"> development workflow.</w:t>
+      </w:r>
+    </w:p>
+    <w:p>
+      <w:proofErr w:type="spellStart"/>
+      <w:r>
+        <w:t>Použité</w:t>
+      </w:r>
+      <w:proofErr w:type="spellEnd"/>
+      <w:r>
+        <w:t xml:space="preserve"> </w:t>
+      </w:r>
+      <w:proofErr w:type="spellStart"/>
+      <w:r>
+        <w:t>nástroje</w:t>
+      </w:r>
+      <w:proofErr w:type="spellEnd"/>
+      <w:r>
+        <w:t>:</w:t>
+      </w:r>
+    </w:p>
+    <w:p>
+      <w:pPr>
+        <w:numPr>
+          <w:ilvl w:val="0"/>
+          <w:numId w:val="4"/>
+        </w:numPr>
+      </w:pPr>
+      <w:r>
+        <w:t xml:space="preserve">GitHub Copilot — </w:t>
+      </w:r>
+      <w:proofErr w:type="spellStart"/>
+      <w:r>
+        <w:t>pomoc</w:t>
+      </w:r>
+      <w:proofErr w:type="spellEnd"/>
+      <w:r>
+        <w:t xml:space="preserve"> </w:t>
+      </w:r>
+      <w:proofErr w:type="spellStart"/>
+      <w:r>
+        <w:t>při</w:t>
+      </w:r>
+      <w:proofErr w:type="spellEnd"/>
+      <w:r>
+        <w:t xml:space="preserve"> </w:t>
+      </w:r>
+      <w:proofErr w:type="spellStart"/>
+      <w:r>
+        <w:t>implementaci</w:t>
+      </w:r>
+      <w:proofErr w:type="spellEnd"/>
+      <w:r>
+        <w:t xml:space="preserve">, </w:t>
+      </w:r>
+      <w:proofErr w:type="spellStart"/>
+      <w:r>
+        <w:t>refactoringu</w:t>
+      </w:r>
+      <w:proofErr w:type="spellEnd"/>
+      <w:r>
+        <w:t xml:space="preserve"> a frontend/UI </w:t>
+      </w:r>
+      <w:proofErr w:type="spellStart"/>
+      <w:r>
+        <w:t>části</w:t>
+      </w:r>
+      <w:proofErr w:type="spellEnd"/>
+      <w:r>
+        <w:t xml:space="preserve"> </w:t>
+      </w:r>
+      <w:proofErr w:type="spellStart"/>
+      <w:r>
+        <w:t>aplikace</w:t>
+      </w:r>
+      <w:proofErr w:type="spellEnd"/>
+      <w:r>
+        <w:t>,</w:t>
+      </w:r>
+    </w:p>
+    <w:p>
+      <w:pPr>
+        <w:numPr>
+          <w:ilvl w:val="0"/>
+          <w:numId w:val="4"/>
+        </w:numPr>
+      </w:pPr>
+      <w:r>
+        <w:t xml:space="preserve">ChatGPT — </w:t>
+      </w:r>
+      <w:proofErr w:type="spellStart"/>
+      <w:r>
+        <w:t>konzultace</w:t>
+      </w:r>
+      <w:proofErr w:type="spellEnd"/>
+      <w:r>
+        <w:t xml:space="preserve"> </w:t>
+      </w:r>
+      <w:proofErr w:type="spellStart"/>
+      <w:r>
+        <w:t>architektury</w:t>
+      </w:r>
+      <w:proofErr w:type="spellEnd"/>
+      <w:r>
+        <w:t xml:space="preserve">, </w:t>
+      </w:r>
+      <w:proofErr w:type="spellStart"/>
+      <w:r>
+        <w:t>návrhu</w:t>
+      </w:r>
+      <w:proofErr w:type="spellEnd"/>
+      <w:r>
+        <w:t xml:space="preserve"> </w:t>
+      </w:r>
+      <w:proofErr w:type="spellStart"/>
+      <w:r>
+        <w:t>aplikace</w:t>
+      </w:r>
+      <w:proofErr w:type="spellEnd"/>
+      <w:r>
+        <w:t xml:space="preserve"> a </w:t>
+      </w:r>
+      <w:proofErr w:type="spellStart"/>
+      <w:r>
+        <w:t>zpracování</w:t>
+      </w:r>
+      <w:proofErr w:type="spellEnd"/>
+      <w:r>
+        <w:t xml:space="preserve"> README.</w:t>
+      </w:r>
+    </w:p>
+    <w:p>
+      <w:proofErr w:type="spellStart"/>
+      <w:r>
+        <w:t>Veškerá</w:t>
+      </w:r>
+      <w:proofErr w:type="spellEnd"/>
+      <w:r>
+        <w:t xml:space="preserve"> </w:t>
+      </w:r>
+      <w:proofErr w:type="spellStart"/>
+      <w:r>
+        <w:t>architektonická</w:t>
+      </w:r>
+      <w:proofErr w:type="spellEnd"/>
+      <w:r>
+        <w:t xml:space="preserve"> a </w:t>
+      </w:r>
+      <w:proofErr w:type="spellStart"/>
+      <w:r>
+        <w:t>technická</w:t>
+      </w:r>
+      <w:proofErr w:type="spellEnd"/>
+      <w:r>
+        <w:t xml:space="preserve"> </w:t>
+      </w:r>
+      <w:proofErr w:type="spellStart"/>
+      <w:r>
+        <w:t>rozhodnutí</w:t>
+      </w:r>
+      <w:proofErr w:type="spellEnd"/>
+      <w:r>
+        <w:t xml:space="preserve"> </w:t>
+      </w:r>
+      <w:proofErr w:type="spellStart"/>
+      <w:r>
+        <w:t>byla</w:t>
+      </w:r>
+      <w:proofErr w:type="spellEnd"/>
+      <w:r>
+        <w:t xml:space="preserve"> </w:t>
+      </w:r>
+      <w:proofErr w:type="spellStart"/>
+      <w:r>
+        <w:t>navržena</w:t>
+      </w:r>
+      <w:proofErr w:type="spellEnd"/>
+      <w:r>
+        <w:t xml:space="preserve"> a </w:t>
+      </w:r>
+      <w:proofErr w:type="spellStart"/>
+      <w:r>
+        <w:t>revidována</w:t>
+      </w:r>
+      <w:proofErr w:type="spellEnd"/>
+      <w:r>
+        <w:t xml:space="preserve"> </w:t>
+      </w:r>
+      <w:proofErr w:type="spellStart"/>
+      <w:r>
+        <w:t>mnou</w:t>
+      </w:r>
+      <w:proofErr w:type="spellEnd"/>
+      <w:r>
+        <w:t xml:space="preserve">. </w:t>
+      </w:r>
+      <w:proofErr w:type="spellStart"/>
+      <w:r>
+        <w:t>Žádná</w:t>
+      </w:r>
+      <w:proofErr w:type="spellEnd"/>
+      <w:r>
+        <w:t xml:space="preserve"> </w:t>
+      </w:r>
+      <w:proofErr w:type="spellStart"/>
+      <w:r>
+        <w:t>část</w:t>
+      </w:r>
+      <w:proofErr w:type="spellEnd"/>
+      <w:r>
+        <w:t xml:space="preserve"> </w:t>
+      </w:r>
+      <w:proofErr w:type="spellStart"/>
+      <w:r>
+        <w:t>aplikace</w:t>
+      </w:r>
+      <w:proofErr w:type="spellEnd"/>
+      <w:r>
+        <w:t xml:space="preserve"> ani </w:t>
+      </w:r>
+      <w:proofErr w:type="spellStart"/>
+      <w:r>
+        <w:t>dokumentace</w:t>
+      </w:r>
+      <w:proofErr w:type="spellEnd"/>
+      <w:r>
+        <w:t xml:space="preserve"> </w:t>
+      </w:r>
+      <w:proofErr w:type="spellStart"/>
+      <w:r>
+        <w:t>nebyla</w:t>
+      </w:r>
+      <w:proofErr w:type="spellEnd"/>
+      <w:r>
+        <w:t xml:space="preserve"> bez </w:t>
+      </w:r>
+      <w:proofErr w:type="spellStart"/>
+      <w:r>
+        <w:t>kontroly</w:t>
+      </w:r>
+      <w:proofErr w:type="spellEnd"/>
+      <w:r>
+        <w:t xml:space="preserve"> </w:t>
+      </w:r>
+      <w:proofErr w:type="spellStart"/>
+      <w:r>
+        <w:t>slepě</w:t>
+      </w:r>
+      <w:proofErr w:type="spellEnd"/>
+      <w:r>
+        <w:t xml:space="preserve"> </w:t>
+      </w:r>
+      <w:proofErr w:type="spellStart"/>
+      <w:r>
+        <w:t>převzata</w:t>
+      </w:r>
+      <w:proofErr w:type="spellEnd"/>
+      <w:r>
+        <w:t xml:space="preserve"> z AI </w:t>
+      </w:r>
+      <w:proofErr w:type="spellStart"/>
+      <w:r>
+        <w:t>generovaného</w:t>
+      </w:r>
+      <w:proofErr w:type="spellEnd"/>
+      <w:r>
+        <w:t xml:space="preserve"> </w:t>
+      </w:r>
+      <w:proofErr w:type="spellStart"/>
+      <w:r>
+        <w:t>výstupu</w:t>
+      </w:r>
+      <w:proofErr w:type="spellEnd"/>
+      <w:r>
+        <w:t>.</w:t>
+      </w:r>
+    </w:p>
+    <w:p>
       <w:proofErr w:type="spellStart"/>
       <w:r>
         <w:t>Aplikace</w:t>
       </w:r>
       <w:proofErr w:type="spellEnd"/>
       <w:r>
-        <w:t xml:space="preserve"> je vytvo</w:t>
-      </w:r>
-      <w:proofErr w:type="spellStart"/>
-      <w:r>
-        <w:t>řena</w:t>
+        <w:t xml:space="preserve"> je </w:t>
+      </w:r>
+      <w:proofErr w:type="spellStart"/>
+      <w:r>
+        <w:t>vytvořena</w:t>
       </w:r>
       <w:proofErr w:type="spellEnd"/>
       <w:r>
@@ -880,7 +1279,7 @@
       </w:r>
       <w:proofErr w:type="spellStart"/>
       <w:r>
-        <w:t>orchestrace</w:t>
+        <w:t>orchestraci</w:t>
       </w:r>
       <w:proofErr w:type="spellEnd"/>
       <w:r>
@@ -1122,9 +1521,11 @@
         <w:t>.</w:t>
       </w:r>
     </w:p>
+    <w:p/>
     <w:p>
       <w:proofErr w:type="spellStart"/>
       <w:r>
+        <w:lastRenderedPageBreak/>
         <w:t>Řešení</w:t>
       </w:r>
       <w:proofErr w:type="spellEnd"/>
@@ -1278,7 +1679,6 @@
     <w:p>
       <w:proofErr w:type="spellStart"/>
       <w:r>
-        <w:lastRenderedPageBreak/>
         <w:t>Řešení</w:t>
       </w:r>
       <w:proofErr w:type="spellEnd"/>
@@ -2105,6 +2505,155 @@
     </w:lvl>
   </w:abstractNum>
   <w:abstractNum w:abstractNumId="2" w15:restartNumberingAfterBreak="0">
+    <w:nsid w:val="4FE00EDA"/>
+    <w:multiLevelType w:val="multilevel"/>
+    <w:tmpl w:val="D4C652C6"/>
+    <w:lvl w:ilvl="0">
+      <w:start w:val="1"/>
+      <w:numFmt w:val="bullet"/>
+      <w:lvlText w:val=""/>
+      <w:lvlJc w:val="left"/>
+      <w:pPr>
+        <w:tabs>
+          <w:tab w:val="num" w:pos="720"/>
+        </w:tabs>
+        <w:ind w:left="720" w:hanging="360"/>
+      </w:pPr>
+      <w:rPr>
+        <w:rFonts w:ascii="Symbol" w:hAnsi="Symbol" w:hint="default"/>
+        <w:sz w:val="20"/>
+      </w:rPr>
+    </w:lvl>
+    <w:lvl w:ilvl="1" w:tentative="1">
+      <w:start w:val="1"/>
+      <w:numFmt w:val="bullet"/>
+      <w:lvlText w:val="o"/>
+      <w:lvlJc w:val="left"/>
+      <w:pPr>
+        <w:tabs>
+          <w:tab w:val="num" w:pos="1440"/>
+        </w:tabs>
+        <w:ind w:left="1440" w:hanging="360"/>
+      </w:pPr>
+      <w:rPr>
+        <w:rFonts w:ascii="Courier New" w:hAnsi="Courier New" w:hint="default"/>
+        <w:sz w:val="20"/>
+      </w:rPr>
+    </w:lvl>
+    <w:lvl w:ilvl="2" w:tentative="1">
+      <w:start w:val="1"/>
+      <w:numFmt w:val="bullet"/>
+      <w:lvlText w:val=""/>
+      <w:lvlJc w:val="left"/>
+      <w:pPr>
+        <w:tabs>
+          <w:tab w:val="num" w:pos="2160"/>
+        </w:tabs>
+        <w:ind w:left="2160" w:hanging="360"/>
+      </w:pPr>
+      <w:rPr>
+        <w:rFonts w:ascii="Wingdings" w:hAnsi="Wingdings" w:hint="default"/>
+        <w:sz w:val="20"/>
+      </w:rPr>
+    </w:lvl>
+    <w:lvl w:ilvl="3" w:tentative="1">
+      <w:start w:val="1"/>
+      <w:numFmt w:val="bullet"/>
+      <w:lvlText w:val=""/>
+      <w:lvlJc w:val="left"/>
+      <w:pPr>
+        <w:tabs>
+          <w:tab w:val="num" w:pos="2880"/>
+        </w:tabs>
+        <w:ind w:left="2880" w:hanging="360"/>
+      </w:pPr>
+      <w:rPr>
+        <w:rFonts w:ascii="Wingdings" w:hAnsi="Wingdings" w:hint="default"/>
+        <w:sz w:val="20"/>
+      </w:rPr>
+    </w:lvl>
+    <w:lvl w:ilvl="4" w:tentative="1">
+      <w:start w:val="1"/>
+      <w:numFmt w:val="bullet"/>
+      <w:lvlText w:val=""/>
+      <w:lvlJc w:val="left"/>
+      <w:pPr>
+        <w:tabs>
+          <w:tab w:val="num" w:pos="3600"/>
+        </w:tabs>
+        <w:ind w:left="3600" w:hanging="360"/>
+      </w:pPr>
+      <w:rPr>
+        <w:rFonts w:ascii="Wingdings" w:hAnsi="Wingdings" w:hint="default"/>
+        <w:sz w:val="20"/>
+      </w:rPr>
+    </w:lvl>
+    <w:lvl w:ilvl="5" w:tentative="1">
+      <w:start w:val="1"/>
+      <w:numFmt w:val="bullet"/>
+      <w:lvlText w:val=""/>
+      <w:lvlJc w:val="left"/>
+      <w:pPr>
+        <w:tabs>
+          <w:tab w:val="num" w:pos="4320"/>
+        </w:tabs>
+        <w:ind w:left="4320" w:hanging="360"/>
+      </w:pPr>
+      <w:rPr>
+        <w:rFonts w:ascii="Wingdings" w:hAnsi="Wingdings" w:hint="default"/>
+        <w:sz w:val="20"/>
+      </w:rPr>
+    </w:lvl>
+    <w:lvl w:ilvl="6" w:tentative="1">
+      <w:start w:val="1"/>
+      <w:numFmt w:val="bullet"/>
+      <w:lvlText w:val=""/>
+      <w:lvlJc w:val="left"/>
+      <w:pPr>
+        <w:tabs>
+          <w:tab w:val="num" w:pos="5040"/>
+        </w:tabs>
+        <w:ind w:left="5040" w:hanging="360"/>
+      </w:pPr>
+      <w:rPr>
+        <w:rFonts w:ascii="Wingdings" w:hAnsi="Wingdings" w:hint="default"/>
+        <w:sz w:val="20"/>
+      </w:rPr>
+    </w:lvl>
+    <w:lvl w:ilvl="7" w:tentative="1">
+      <w:start w:val="1"/>
+      <w:numFmt w:val="bullet"/>
+      <w:lvlText w:val=""/>
+      <w:lvlJc w:val="left"/>
+      <w:pPr>
+        <w:tabs>
+          <w:tab w:val="num" w:pos="5760"/>
+        </w:tabs>
+        <w:ind w:left="5760" w:hanging="360"/>
+      </w:pPr>
+      <w:rPr>
+        <w:rFonts w:ascii="Wingdings" w:hAnsi="Wingdings" w:hint="default"/>
+        <w:sz w:val="20"/>
+      </w:rPr>
+    </w:lvl>
+    <w:lvl w:ilvl="8" w:tentative="1">
+      <w:start w:val="1"/>
+      <w:numFmt w:val="bullet"/>
+      <w:lvlText w:val=""/>
+      <w:lvlJc w:val="left"/>
+      <w:pPr>
+        <w:tabs>
+          <w:tab w:val="num" w:pos="6480"/>
+        </w:tabs>
+        <w:ind w:left="6480" w:hanging="360"/>
+      </w:pPr>
+      <w:rPr>
+        <w:rFonts w:ascii="Wingdings" w:hAnsi="Wingdings" w:hint="default"/>
+        <w:sz w:val="20"/>
+      </w:rPr>
+    </w:lvl>
+  </w:abstractNum>
+  <w:abstractNum w:abstractNumId="3" w15:restartNumberingAfterBreak="0">
     <w:nsid w:val="73A83527"/>
     <w:multiLevelType w:val="multilevel"/>
     <w:tmpl w:val="C63EF13A"/>
@@ -2260,6 +2809,9 @@
     <w:abstractNumId w:val="1"/>
   </w:num>
   <w:num w:numId="3" w16cid:durableId="49159208">
+    <w:abstractNumId w:val="3"/>
+  </w:num>
+  <w:num w:numId="4" w16cid:durableId="1725327837">
     <w:abstractNumId w:val="2"/>
   </w:num>
 </w:numbering>

</xml_diff>